<commit_message>
Sync to upstream it-28 (SHA: 1465436d78c94c51d1abeabfdc3720273142c561)
</commit_message>
<xml_diff>
--- a/BaseApp/Source/Base Application/Inventory/Reports/InventoryOrderDetails.docx
+++ b/BaseApp/Source/Base Application/Inventory/Reports/InventoryOrderDetails.docx
@@ -26,7 +26,7 @@
       <w:tr>
         <w:trPr>
           <w:cnfStyle w:val="100000000000" w:firstRow="1" w:lastRow="0" w:firstColumn="0" w:lastColumn="0" w:oddVBand="0" w:evenVBand="0" w:oddHBand="0" w:evenHBand="0" w:firstRowFirstColumn="0" w:firstRowLastColumn="0" w:lastRowFirstColumn="0" w:lastRowLastColumn="0"/>
-          <w:trHeight w:val="454" w:hRule="exact"/>
+          <w:trHeight w:val="454" w:hRule="atLeast"/>
         </w:trPr>
         <w:sdt>
           <w:sdtPr>
@@ -48,7 +48,7 @@
             <w:tc>
               <w:tcPr>
                 <w:cnfStyle w:val="001000000000" w:firstRow="0" w:lastRow="0" w:firstColumn="1" w:lastColumn="0" w:oddVBand="0" w:evenVBand="0" w:oddHBand="0" w:evenHBand="0" w:firstRowFirstColumn="0" w:firstRowLastColumn="0" w:lastRowFirstColumn="0" w:lastRowLastColumn="0"/>
-                <w:tcW w:w="1104" w:type="dxa"/>
+                <w:tcW w:w="1701" w:type="dxa"/>
                 <w:tcBorders>
                   <w:top w:val="nil"/>
                   <w:left w:val="nil"/>
@@ -99,7 +99,7 @@
           <w:sdtContent>
             <w:tc>
               <w:tcPr>
-                <w:tcW w:w="3019" w:type="dxa"/>
+                <w:tcW w:w="2422" w:type="dxa"/>
                 <w:tcBorders>
                   <w:top w:val="nil"/>
                   <w:left w:val="nil"/>
@@ -576,12 +576,12 @@
       <w:tr>
         <w:trPr>
           <w:cnfStyle w:val="000000100000" w:firstRow="0" w:lastRow="0" w:firstColumn="0" w:lastColumn="0" w:oddVBand="0" w:evenVBand="0" w:oddHBand="1" w:evenHBand="0" w:firstRowFirstColumn="0" w:firstRowLastColumn="0" w:lastRowFirstColumn="0" w:lastRowLastColumn="0"/>
-          <w:trHeight w:val="85" w:hRule="exact"/>
+          <w:trHeight w:val="85" w:hRule="atLeast"/>
         </w:trPr>
         <w:tc>
           <w:tcPr>
             <w:cnfStyle w:val="001000000000" w:firstRow="0" w:lastRow="0" w:firstColumn="1" w:lastColumn="0" w:oddVBand="0" w:evenVBand="0" w:oddHBand="0" w:evenHBand="0" w:firstRowFirstColumn="0" w:firstRowLastColumn="0" w:lastRowFirstColumn="0" w:lastRowLastColumn="0"/>
-            <w:tcW w:w="1104" w:type="dxa"/>
+            <w:tcW w:w="1701" w:type="dxa"/>
             <w:tcBorders>
               <w:top w:val="nil"/>
               <w:left w:val="nil"/>
@@ -604,7 +604,7 @@
         </w:tc>
         <w:tc>
           <w:tcPr>
-            <w:tcW w:w="3019" w:type="dxa"/>
+            <w:tcW w:w="2422" w:type="dxa"/>
             <w:tcBorders>
               <w:top w:val="nil"/>
               <w:left w:val="nil"/>
@@ -803,12 +803,12 @@
       </w:tr>
       <w:tr>
         <w:trPr>
-          <w:trHeight w:val="85" w:hRule="exact"/>
+          <w:trHeight w:val="85" w:hRule="atLeast"/>
         </w:trPr>
         <w:tc>
           <w:tcPr>
             <w:cnfStyle w:val="001000000000" w:firstRow="0" w:lastRow="0" w:firstColumn="1" w:lastColumn="0" w:oddVBand="0" w:evenVBand="0" w:oddHBand="0" w:evenHBand="0" w:firstRowFirstColumn="0" w:firstRowLastColumn="0" w:lastRowFirstColumn="0" w:lastRowLastColumn="0"/>
-            <w:tcW w:w="1104" w:type="dxa"/>
+            <w:tcW w:w="1701" w:type="dxa"/>
             <w:tcBorders>
               <w:top w:val="single" w:color="auto" w:sz="4" w:space="0"/>
               <w:left w:val="nil"/>
@@ -831,7 +831,7 @@
         </w:tc>
         <w:tc>
           <w:tcPr>
-            <w:tcW w:w="3019" w:type="dxa"/>
+            <w:tcW w:w="2422" w:type="dxa"/>
             <w:tcBorders>
               <w:top w:val="single" w:color="auto" w:sz="4" w:space="0"/>
               <w:left w:val="nil"/>
@@ -1081,12 +1081,12 @@
               <w:tr>
                 <w:trPr>
                   <w:cnfStyle w:val="000000100000" w:firstRow="0" w:lastRow="0" w:firstColumn="0" w:lastColumn="0" w:oddVBand="0" w:evenVBand="0" w:oddHBand="1" w:evenHBand="0" w:firstRowFirstColumn="0" w:firstRowLastColumn="0" w:lastRowFirstColumn="0" w:lastRowLastColumn="0"/>
-                  <w:trHeight w:val="170" w:hRule="exact"/>
+                  <w:trHeight w:val="170" w:hRule="atLeast"/>
                 </w:trPr>
                 <w:tc>
                   <w:tcPr>
                     <w:cnfStyle w:val="001000000000" w:firstRow="0" w:lastRow="0" w:firstColumn="1" w:lastColumn="0" w:oddVBand="0" w:evenVBand="0" w:oddHBand="0" w:evenHBand="0" w:firstRowFirstColumn="0" w:firstRowLastColumn="0" w:lastRowFirstColumn="0" w:lastRowLastColumn="0"/>
-                    <w:tcW w:w="1104" w:type="dxa"/>
+                    <w:tcW w:w="1701" w:type="dxa"/>
                     <w:tcBorders>
                       <w:top w:val="nil"/>
                       <w:left w:val="nil"/>
@@ -1107,7 +1107,7 @@
                 </w:tc>
                 <w:tc>
                   <w:tcPr>
-                    <w:tcW w:w="3019" w:type="dxa"/>
+                    <w:tcW w:w="2422" w:type="dxa"/>
                     <w:tcBorders>
                       <w:top w:val="nil"/>
                       <w:left w:val="nil"/>
@@ -1306,7 +1306,7 @@
               </w:tr>
               <w:tr>
                 <w:trPr>
-                  <w:trHeight w:val="227" w:hRule="exact"/>
+                  <w:trHeight w:val="227" w:hRule="atLeast"/>
                 </w:trPr>
                 <w:sdt>
                   <w:sdtPr>
@@ -1327,7 +1327,7 @@
                     <w:tc>
                       <w:tcPr>
                         <w:cnfStyle w:val="001000000000" w:firstRow="0" w:lastRow="0" w:firstColumn="1" w:lastColumn="0" w:oddVBand="0" w:evenVBand="0" w:oddHBand="0" w:evenHBand="0" w:firstRowFirstColumn="0" w:firstRowLastColumn="0" w:lastRowFirstColumn="0" w:lastRowLastColumn="0"/>
-                        <w:tcW w:w="1104" w:type="dxa"/>
+                        <w:tcW w:w="1701" w:type="dxa"/>
                         <w:tcBorders>
                           <w:top w:val="nil"/>
                           <w:left w:val="nil"/>
@@ -1378,7 +1378,7 @@
                   <w:sdtContent>
                     <w:tc>
                       <w:tcPr>
-                        <w:tcW w:w="3019" w:type="dxa"/>
+                        <w:tcW w:w="2422" w:type="dxa"/>
                         <w:tcBorders>
                           <w:top w:val="nil"/>
                           <w:left w:val="nil"/>
@@ -1644,7 +1644,7 @@
                       <w:tr>
                         <w:trPr>
                           <w:cnfStyle w:val="000000100000" w:firstRow="0" w:lastRow="0" w:firstColumn="0" w:lastColumn="0" w:oddVBand="0" w:evenVBand="0" w:oddHBand="1" w:evenHBand="0" w:firstRowFirstColumn="0" w:firstRowLastColumn="0" w:lastRowFirstColumn="0" w:lastRowLastColumn="0"/>
-                          <w:trHeight w:val="210" w:hRule="exact"/>
+                          <w:trHeight w:val="210" w:hRule="atLeast"/>
                         </w:trPr>
                         <w:sdt>
                           <w:sdtPr>
@@ -1673,7 +1673,7 @@
                             <w:tc>
                               <w:tcPr>
                                 <w:cnfStyle w:val="001000000000" w:firstRow="0" w:lastRow="0" w:firstColumn="1" w:lastColumn="0" w:oddVBand="0" w:evenVBand="0" w:oddHBand="0" w:evenHBand="0" w:firstRowFirstColumn="0" w:firstRowLastColumn="0" w:lastRowFirstColumn="0" w:lastRowLastColumn="0"/>
-                                <w:tcW w:w="1104" w:type="dxa"/>
+                                <w:tcW w:w="1701" w:type="dxa"/>
                                 <w:tcBorders>
                                   <w:top w:val="nil"/>
                                   <w:left w:val="nil"/>
@@ -1727,7 +1727,7 @@
                           <w:sdtContent>
                             <w:tc>
                               <w:tcPr>
-                                <w:tcW w:w="3019" w:type="dxa"/>
+                                <w:tcW w:w="2422" w:type="dxa"/>
                                 <w:tcBorders>
                                   <w:top w:val="nil"/>
                                   <w:left w:val="nil"/>
@@ -2180,12 +2180,12 @@
               </w:sdt>
               <w:tr>
                 <w:trPr>
-                  <w:trHeight w:val="227" w:hRule="exact"/>
+                  <w:trHeight w:val="227" w:hRule="atLeast"/>
                 </w:trPr>
                 <w:tc>
                   <w:tcPr>
                     <w:cnfStyle w:val="001000000000" w:firstRow="0" w:lastRow="0" w:firstColumn="1" w:lastColumn="0" w:oddVBand="0" w:evenVBand="0" w:oddHBand="0" w:evenHBand="0" w:firstRowFirstColumn="0" w:firstRowLastColumn="0" w:lastRowFirstColumn="0" w:lastRowLastColumn="0"/>
-                    <w:tcW w:w="1104" w:type="dxa"/>
+                    <w:tcW w:w="1701" w:type="dxa"/>
                     <w:tcBorders>
                       <w:top w:val="nil"/>
                       <w:left w:val="nil"/>
@@ -2227,7 +2227,7 @@
                   <w:sdtContent>
                     <w:tc>
                       <w:tcPr>
-                        <w:tcW w:w="3019" w:type="dxa"/>
+                        <w:tcW w:w="2422" w:type="dxa"/>
                         <w:tcBorders>
                           <w:top w:val="nil"/>
                           <w:left w:val="nil"/>
@@ -2582,12 +2582,12 @@
       <w:tr>
         <w:trPr>
           <w:cnfStyle w:val="000000100000" w:firstRow="0" w:lastRow="0" w:firstColumn="0" w:lastColumn="0" w:oddVBand="0" w:evenVBand="0" w:oddHBand="1" w:evenHBand="0" w:firstRowFirstColumn="0" w:firstRowLastColumn="0" w:lastRowFirstColumn="0" w:lastRowLastColumn="0"/>
-          <w:trHeight w:val="170" w:hRule="exact"/>
+          <w:trHeight w:val="170" w:hRule="atLeast"/>
         </w:trPr>
         <w:tc>
           <w:tcPr>
             <w:cnfStyle w:val="001000000000" w:firstRow="0" w:lastRow="0" w:firstColumn="1" w:lastColumn="0" w:oddVBand="0" w:evenVBand="0" w:oddHBand="0" w:evenHBand="0" w:firstRowFirstColumn="0" w:firstRowLastColumn="0" w:lastRowFirstColumn="0" w:lastRowLastColumn="0"/>
-            <w:tcW w:w="1104" w:type="dxa"/>
+            <w:tcW w:w="1701" w:type="dxa"/>
             <w:tcBorders>
               <w:top w:val="nil"/>
               <w:left w:val="nil"/>
@@ -2608,7 +2608,7 @@
         </w:tc>
         <w:tc>
           <w:tcPr>
-            <w:tcW w:w="3019" w:type="dxa"/>
+            <w:tcW w:w="2422" w:type="dxa"/>
             <w:tcBorders>
               <w:top w:val="nil"/>
               <w:left w:val="nil"/>
@@ -2807,12 +2807,12 @@
       </w:tr>
       <w:tr>
         <w:trPr>
-          <w:trHeight w:val="567" w:hRule="exact"/>
+          <w:trHeight w:val="567" w:hRule="atLeast"/>
         </w:trPr>
         <w:tc>
           <w:tcPr>
             <w:cnfStyle w:val="001000000000" w:firstRow="0" w:lastRow="0" w:firstColumn="1" w:lastColumn="0" w:oddVBand="0" w:evenVBand="0" w:oddHBand="0" w:evenHBand="0" w:firstRowFirstColumn="0" w:firstRowLastColumn="0" w:lastRowFirstColumn="0" w:lastRowLastColumn="0"/>
-            <w:tcW w:w="1104" w:type="dxa"/>
+            <w:tcW w:w="1701" w:type="dxa"/>
             <w:tcBorders>
               <w:top w:val="nil"/>
               <w:left w:val="nil"/>
@@ -2833,7 +2833,7 @@
         </w:tc>
         <w:tc>
           <w:tcPr>
-            <w:tcW w:w="3019" w:type="dxa"/>
+            <w:tcW w:w="2422" w:type="dxa"/>
             <w:tcBorders>
               <w:top w:val="nil"/>
               <w:left w:val="nil"/>

</xml_diff>